<commit_message>
Update house price project report
Publish the latest edits to the detailed Word project report only.
</commit_message>
<xml_diff>
--- a/docs/House_Price_Prediction_Project_Report.docx
+++ b/docs/House_Price_Prediction_Project_Report.docx
@@ -62,15 +62,96 @@
         <w:t>link :</w:t>
       </w:r>
       <w:proofErr w:type="gramEnd"/>
+      <w:r>
+        <w:t xml:space="preserve"> </w:t>
+      </w:r>
+      <w:hyperlink r:id="rId8" w:history="1">
+        <w:r>
+          <w:rPr>
+            <w:rStyle w:val="Hyperlink"/>
+            <w:sz w:val="22"/>
+          </w:rPr>
+          <w:t>https://github.com/LeoPavan-gisma/developer-arina-Housing-project-</w:t>
+        </w:r>
+      </w:hyperlink>
     </w:p>
     <w:p>
       <w:pPr>
-        <w:spacing w:after="20"/>
-        <w:jc w:val="center"/>
+        <w:spacing w:before="100"/>
         <w:rPr>
           <w:color w:val="auto"/>
         </w:rPr>
       </w:pPr>
+      <w:r>
+        <w:rPr>
+          <w:color w:val="auto"/>
+          <w:sz w:val="22"/>
+        </w:rPr>
+        <w:t>D</w:t>
+      </w:r>
+      <w:r>
+        <w:rPr>
+          <w:color w:val="auto"/>
+          <w:sz w:val="22"/>
+        </w:rPr>
+        <w:t>rive</w:t>
+      </w:r>
+      <w:r>
+        <w:rPr>
+          <w:color w:val="auto"/>
+          <w:sz w:val="22"/>
+        </w:rPr>
+        <w:t xml:space="preserve"> </w:t>
+      </w:r>
+      <w:proofErr w:type="gramStart"/>
+      <w:r>
+        <w:rPr>
+          <w:color w:val="auto"/>
+          <w:sz w:val="22"/>
+        </w:rPr>
+        <w:t>li</w:t>
+      </w:r>
+      <w:r>
+        <w:rPr>
+          <w:color w:val="auto"/>
+          <w:sz w:val="22"/>
+        </w:rPr>
+        <w:t>n</w:t>
+      </w:r>
+      <w:r>
+        <w:rPr>
+          <w:color w:val="auto"/>
+          <w:sz w:val="22"/>
+        </w:rPr>
+        <w:t>k :</w:t>
+      </w:r>
+      <w:proofErr w:type="gramEnd"/>
+      <w:r>
+        <w:t xml:space="preserve"> </w:t>
+      </w:r>
+      <w:hyperlink r:id="rId9" w:history="1">
+        <w:r>
+          <w:rPr>
+            <w:rStyle w:val="Hyperlink"/>
+            <w:sz w:val="22"/>
+          </w:rPr>
+          <w:t>https://docs.google.com/docu</w:t>
+        </w:r>
+        <w:r>
+          <w:rPr>
+            <w:rStyle w:val="Hyperlink"/>
+            <w:sz w:val="22"/>
+          </w:rPr>
+          <w:t>m</w:t>
+        </w:r>
+        <w:r>
+          <w:rPr>
+            <w:rStyle w:val="Hyperlink"/>
+            <w:sz w:val="22"/>
+          </w:rPr>
+          <w:t>ent/d/1rO7iaU_QKoByUaZkrEAA42oG8fOIVLze/edit?usp=sharing&amp;ouid=114040524816880611514&amp;rtpof=true&amp;sd=true</w:t>
+        </w:r>
+      </w:hyperlink>
       <w:r>
         <w:rPr>
           <w:noProof/>
@@ -92,7 +173,7 @@
                     <pic:cNvPicPr/>
                   </pic:nvPicPr>
                   <pic:blipFill>
-                    <a:blip r:embed="rId8"/>
+                    <a:blip r:embed="rId10"/>
                     <a:stretch>
                       <a:fillRect/>
                     </a:stretch>
@@ -469,6 +550,7 @@
         <w:rPr>
           <w:color w:val="auto"/>
         </w:rPr>
+        <w:lastRenderedPageBreak/>
         <w:t>1. Executive Summary</w:t>
       </w:r>
     </w:p>
@@ -482,14 +564,7 @@
         <w:rPr>
           <w:color w:val="auto"/>
         </w:rPr>
-        <w:t xml:space="preserve">This project implements a modular machine-learning solution that estimates asking prices from property size, room counts, age, location, and property type. The workflow covers data validation, leakage-aware preprocessing, three-model </w:t>
-      </w:r>
-      <w:r>
-        <w:rPr>
-          <w:color w:val="auto"/>
-        </w:rPr>
-        <w:lastRenderedPageBreak/>
-        <w:t>comparison, cross-validation, holdout evaluation, feature interpretation, model persistence, REST serving, and an interactive Streamlit dashboard.</w:t>
+        <w:t>This project implements a modular machine-learning solution that estimates asking prices from property size, room counts, age, location, and property type. The workflow covers data validation, leakage-aware preprocessing, three-model comparison, cross-validation, holdout evaluation, feature interpretation, model persistence, REST serving, and an interactive Streamlit dashboard.</w:t>
       </w:r>
     </w:p>
     <w:p>
@@ -1321,6 +1396,7 @@
                 <w:color w:val="auto"/>
                 <w:sz w:val="16"/>
               </w:rPr>
+              <w:lastRenderedPageBreak/>
               <w:t>Field</w:t>
             </w:r>
           </w:p>
@@ -1656,7 +1732,6 @@
                 <w:color w:val="auto"/>
                 <w:sz w:val="16"/>
               </w:rPr>
-              <w:lastRenderedPageBreak/>
               <w:t>Bedrooms</w:t>
             </w:r>
           </w:p>
@@ -2352,7 +2427,7 @@
                     <pic:cNvPicPr/>
                   </pic:nvPicPr>
                   <pic:blipFill>
-                    <a:blip r:embed="rId9"/>
+                    <a:blip r:embed="rId11"/>
                     <a:stretch>
                       <a:fillRect/>
                     </a:stretch>
@@ -2419,7 +2494,7 @@
                     <pic:cNvPicPr/>
                   </pic:nvPicPr>
                   <pic:blipFill>
-                    <a:blip r:embed="rId10"/>
+                    <a:blip r:embed="rId12"/>
                     <a:stretch>
                       <a:fillRect/>
                     </a:stretch>
@@ -2487,7 +2562,7 @@
                     <pic:cNvPicPr/>
                   </pic:nvPicPr>
                   <pic:blipFill>
-                    <a:blip r:embed="rId11"/>
+                    <a:blip r:embed="rId13"/>
                     <a:stretch>
                       <a:fillRect/>
                     </a:stretch>
@@ -3680,7 +3755,7 @@
                     <pic:cNvPicPr/>
                   </pic:nvPicPr>
                   <pic:blipFill>
-                    <a:blip r:embed="rId12"/>
+                    <a:blip r:embed="rId14"/>
                     <a:stretch>
                       <a:fillRect/>
                     </a:stretch>
@@ -4464,7 +4539,7 @@
                     <pic:cNvPicPr/>
                   </pic:nvPicPr>
                   <pic:blipFill>
-                    <a:blip r:embed="rId13"/>
+                    <a:blip r:embed="rId15"/>
                     <a:stretch>
                       <a:fillRect/>
                     </a:stretch>
@@ -4668,7 +4743,7 @@
                     <pic:cNvPicPr/>
                   </pic:nvPicPr>
                   <pic:blipFill>
-                    <a:blip r:embed="rId8"/>
+                    <a:blip r:embed="rId10"/>
                     <a:stretch>
                       <a:fillRect/>
                     </a:stretch>
@@ -6701,7 +6776,7 @@
       </w:pPr>
     </w:p>
     <w:sectPr>
-      <w:footerReference w:type="default" r:id="rId14"/>
+      <w:footerReference w:type="default" r:id="rId16"/>
       <w:pgSz w:w="12240" w:h="15840"/>
       <w:pgMar w:top="979" w:right="1123" w:bottom="979" w:left="1123" w:header="720" w:footer="720" w:gutter="0"/>
       <w:cols w:space="720"/>
@@ -18371,6 +18446,41 @@
       </w:tcPr>
     </w:tblStylePr>
   </w:style>
+  <w:style w:type="character" w:styleId="Hyperlink">
+    <w:name w:val="Hyperlink"/>
+    <w:basedOn w:val="DefaultParagraphFont"/>
+    <w:uiPriority w:val="99"/>
+    <w:unhideWhenUsed/>
+    <w:rsid w:val="008D7A08"/>
+    <w:rPr>
+      <w:color w:val="0000FF" w:themeColor="hyperlink"/>
+      <w:u w:val="single"/>
+    </w:rPr>
+  </w:style>
+  <w:style w:type="character" w:styleId="UnresolvedMention">
+    <w:name w:val="Unresolved Mention"/>
+    <w:basedOn w:val="DefaultParagraphFont"/>
+    <w:uiPriority w:val="99"/>
+    <w:semiHidden/>
+    <w:unhideWhenUsed/>
+    <w:rsid w:val="008D7A08"/>
+    <w:rPr>
+      <w:color w:val="605E5C"/>
+      <w:shd w:val="clear" w:color="auto" w:fill="E1DFDD"/>
+    </w:rPr>
+  </w:style>
+  <w:style w:type="character" w:styleId="FollowedHyperlink">
+    <w:name w:val="FollowedHyperlink"/>
+    <w:basedOn w:val="DefaultParagraphFont"/>
+    <w:uiPriority w:val="99"/>
+    <w:semiHidden/>
+    <w:unhideWhenUsed/>
+    <w:rsid w:val="007C1BBB"/>
+    <w:rPr>
+      <w:color w:val="800080" w:themeColor="followedHyperlink"/>
+      <w:u w:val="single"/>
+    </w:rPr>
+  </w:style>
 </w:styles>
 </file>
 

</xml_diff>